<commit_message>
docs: add BA requirements for mock sprint
</commit_message>
<xml_diff>
--- a/docs/Master-Document-Team40.docx
+++ b/docs/Master-Document-Team40.docx
@@ -1,6 +1,6 @@
 
 <file path=word/document.xml><?xml version="1.0" encoding="utf-8"?>
-<w:document xmlns:wpc="http://schemas.microsoft.com/office/word/2010/wordprocessingCanvas" xmlns:cx="http://schemas.microsoft.com/office/drawing/2014/chartex" xmlns:cx1="http://schemas.microsoft.com/office/drawing/2015/9/8/chartex" xmlns:cx2="http://schemas.microsoft.com/office/drawing/2015/10/21/chartex" xmlns:cx3="http://schemas.microsoft.com/office/drawing/2016/5/9/chartex" xmlns:cx4="http://schemas.microsoft.com/office/drawing/2016/5/10/chartex" xmlns:cx5="http://schemas.microsoft.com/office/drawing/2016/5/11/chartex" xmlns:cx6="http://schemas.microsoft.com/office/drawing/2016/5/12/chartex" xmlns:cx7="http://schemas.microsoft.com/office/drawing/2016/5/13/chartex" xmlns:cx8="http://schemas.microsoft.com/office/drawing/2016/5/14/chartex" xmlns:mc="http://schemas.openxmlformats.org/markup-compatibility/2006" xmlns:aink="http://schemas.microsoft.com/office/drawing/2016/ink" xmlns:am3d="http://schemas.microsoft.com/office/drawing/2017/model3d" xmlns:o="urn:schemas-microsoft-com:office:office" xmlns:oel="http://schemas.microsoft.com/office/2019/extlst" xmlns:r="http://schemas.openxmlformats.org/officeDocument/2006/relationships" xmlns:m="http://schemas.openxmlformats.org/officeDocument/2006/math" xmlns:v="urn:schemas-microsoft-com:vml" xmlns:wp14="http://schemas.microsoft.com/office/word/2010/wordprocessingDrawing" xmlns:wp="http://schemas.openxmlformats.org/drawingml/2006/wordprocessingDrawing" xmlns:w10="urn:schemas-microsoft-com:office:word" xmlns:w="http://schemas.openxmlformats.org/wordprocessingml/2006/main" xmlns:w14="http://schemas.microsoft.com/office/word/2010/wordml" xmlns:w15="http://schemas.microsoft.com/office/word/2012/wordml" xmlns:w16cex="http://schemas.microsoft.com/office/word/2018/wordml/cex" xmlns:w16cid="http://schemas.microsoft.com/office/word/2016/wordml/cid" xmlns:w16="http://schemas.microsoft.com/office/word/2018/wordml" xmlns:w16du="http://schemas.microsoft.com/office/word/2023/wordml/word16du" xmlns:w16sdtdh="http://schemas.microsoft.com/office/word/2020/wordml/sdtdatahash" xmlns:w16se="http://schemas.microsoft.com/office/word/2015/wordml/symex" xmlns:wpg="http://schemas.microsoft.com/office/word/2010/wordprocessingGroup" xmlns:wpi="http://schemas.microsoft.com/office/word/2010/wordprocessingInk" xmlns:wne="http://schemas.microsoft.com/office/word/2006/wordml" xmlns:wps="http://schemas.microsoft.com/office/word/2010/wordprocessingShape" mc:Ignorable="w14 w15 w16se w16cid w16 w16cex w16sdtdh w16du wp14">
+<w:document xmlns:wpc="http://schemas.microsoft.com/office/word/2010/wordprocessingCanvas" xmlns:cx="http://schemas.microsoft.com/office/drawing/2014/chartex" xmlns:cx1="http://schemas.microsoft.com/office/drawing/2015/9/8/chartex" xmlns:cx2="http://schemas.microsoft.com/office/drawing/2015/10/21/chartex" xmlns:cx3="http://schemas.microsoft.com/office/drawing/2016/5/9/chartex" xmlns:cx4="http://schemas.microsoft.com/office/drawing/2016/5/10/chartex" xmlns:cx5="http://schemas.microsoft.com/office/drawing/2016/5/11/chartex" xmlns:cx6="http://schemas.microsoft.com/office/drawing/2016/5/12/chartex" xmlns:cx7="http://schemas.microsoft.com/office/drawing/2016/5/13/chartex" xmlns:cx8="http://schemas.microsoft.com/office/drawing/2016/5/14/chartex" xmlns:mc="http://schemas.openxmlformats.org/markup-compatibility/2006" xmlns:m="http://schemas.openxmlformats.org/officeDocument/2006/math" xmlns:aink="http://schemas.microsoft.com/office/drawing/2016/ink" xmlns:am3d="http://schemas.microsoft.com/office/drawing/2017/model3d" xmlns:oel="http://schemas.microsoft.com/office/2019/extlst" xmlns:r="http://schemas.openxmlformats.org/officeDocument/2006/relationships" xmlns:wp14="http://schemas.microsoft.com/office/word/2010/wordprocessingDrawing" xmlns:wp="http://schemas.openxmlformats.org/drawingml/2006/wordprocessingDrawing" xmlns:wpg="http://schemas.microsoft.com/office/word/2010/wordprocessingGroup" xmlns:wpi="http://schemas.microsoft.com/office/word/2010/wordprocessingInk" xmlns:wps="http://schemas.microsoft.com/office/word/2010/wordprocessingShape" xmlns:o="urn:schemas-microsoft-com:office:office" xmlns:v="urn:schemas-microsoft-com:vml" xmlns:w10="urn:schemas-microsoft-com:office:word" xmlns:w="http://schemas.openxmlformats.org/wordprocessingml/2006/main" xmlns:w14="http://schemas.microsoft.com/office/word/2010/wordml" xmlns:w15="http://schemas.microsoft.com/office/word/2012/wordml" xmlns:w16cex="http://schemas.microsoft.com/office/word/2018/wordml/cex" xmlns:w16cid="http://schemas.microsoft.com/office/word/2016/wordml/cid" xmlns:w16="http://schemas.microsoft.com/office/word/2018/wordml" xmlns:w16sdtdh="http://schemas.microsoft.com/office/word/2020/wordml/sdtdatahash" xmlns:w16sdtfl="http://schemas.microsoft.com/office/word/2024/wordml/sdtformatlock" xmlns:w16se="http://schemas.microsoft.com/office/word/2015/wordml/symex" xmlns:w16du="http://schemas.microsoft.com/office/word/2023/wordml/word16du" xmlns:wne="http://schemas.microsoft.com/office/word/2006/wordml" mc:Ignorable="w14 w15 w16se w16cid w16 w16cex w16sdtdh w16sdtfl w16du wp14">
   <w:body>
     <w:p>
       <w:pPr>
@@ -14,9 +14,6 @@
     <w:p>
       <w:pPr>
         <w:spacing w:after="280"/>
-        <w:rPr>
-          <w:rFonts w:hint="eastAsia"/>
-        </w:rPr>
       </w:pPr>
     </w:p>
     <w:p>
@@ -104,24 +101,9 @@
             </w:r>
           </w:p>
           <w:p>
-            <w:pPr>
-              <w:rPr>
-                <w:rFonts w:hint="eastAsia"/>
-              </w:rPr>
-            </w:pPr>
-            <w:proofErr w:type="spellStart"/>
-            <w:r>
-              <w:t>Shakthijhaa</w:t>
-            </w:r>
-            <w:proofErr w:type="spellEnd"/>
-            <w:r>
-              <w:t xml:space="preserve"> </w:t>
-            </w:r>
-            <w:proofErr w:type="spellStart"/>
-            <w:r>
-              <w:t>Sivagnanam</w:t>
-            </w:r>
-            <w:proofErr w:type="spellEnd"/>
+            <w:r>
+              <w:t>Shakthijhaa Sivagnanam</w:t>
+            </w:r>
           </w:p>
         </w:tc>
         <w:tc>
@@ -164,27 +146,19 @@
               <w:rPr>
                 <w:color w:val="1E2761"/>
               </w:rPr>
-              <w:t>Friday, 7 August 2026</w:t>
+              <w:t xml:space="preserve">Friday, </w:t>
             </w:r>
             <w:r>
               <w:rPr>
                 <w:color w:val="1E2761"/>
               </w:rPr>
-              <w:t xml:space="preserve"> </w:t>
-            </w:r>
-            <w:proofErr w:type="gramStart"/>
+              <w:t>10</w:t>
+            </w:r>
             <w:r>
               <w:rPr>
                 <w:color w:val="1E2761"/>
               </w:rPr>
-              <w:t>( Example</w:t>
-            </w:r>
-            <w:proofErr w:type="gramEnd"/>
-            <w:r>
-              <w:rPr>
-                <w:color w:val="1E2761"/>
-              </w:rPr>
-              <w:t>)</w:t>
+              <w:t xml:space="preserve"> August 2026 </w:t>
             </w:r>
           </w:p>
         </w:tc>
@@ -215,10 +189,7 @@
         <w:t xml:space="preserve">Done: </w:t>
       </w:r>
       <w:r>
-        <w:t>Documented required fields for the team page (team name, project name, per-member photo/name/role, about-us blurb) and confirmed login work is styling-only, no auth logic changes.</w:t>
-      </w:r>
-      <w:r>
-        <w:t xml:space="preserve"> (example)</w:t>
+        <w:t>Completed and documented the Business Analysis requirements for the Task 2 Mock Sprint feature, covering the styled Login Page, existing authentication behaviour, Login → Team Page redirect, Team Page content, non-functional requirements, acceptance criteria, scope, dependencies and UX handoff requirements.</w:t>
       </w:r>
     </w:p>
     <w:p>
@@ -233,7 +204,16 @@
         <w:t xml:space="preserve">Deliverable: </w:t>
       </w:r>
       <w:r>
-        <w:t>Requirements document, committed to the team repo.</w:t>
+        <w:t xml:space="preserve">Business Analysis Requirements document committed to the team GitHub repository: </w:t>
+      </w:r>
+      <w:r>
+        <w:rPr>
+          <w:rStyle w:val="HTMLCode"/>
+          <w:rFonts w:ascii="Times New Roman" w:hAnsi="Times New Roman" w:cs="Times New Roman"/>
+          <w:sz w:val="24"/>
+          <w:szCs w:val="24"/>
+        </w:rPr>
+        <w:t>docs/task2/BA-Requirements.md</w:t>
       </w:r>
     </w:p>
     <w:p>
@@ -248,7 +228,25 @@
         <w:t xml:space="preserve">Note for next role: </w:t>
       </w:r>
       <w:r>
-        <w:t>UX — we have 5 team members, one doesn't have a headshot yet, so the design needs a placeholder-avatar treatment. Two members also have longer blurbs, so don't assume a one-line blurb.</w:t>
+        <w:t xml:space="preserve">UX — please use the documented BA requirements to design the styled Login Page and Team Page. The existing email/password and Google sign-in functionality must be preserved, while successful authentication must ultimately direct users to </w:t>
+      </w:r>
+      <w:r>
+        <w:rPr>
+          <w:rStyle w:val="HTMLCode"/>
+        </w:rPr>
+        <w:t>/team</w:t>
+      </w:r>
+      <w:r>
+        <w:t xml:space="preserve">. The Team Page must display </w:t>
+      </w:r>
+      <w:r>
+        <w:rPr>
+          <w:rStyle w:val="Strong"/>
+        </w:rPr>
+        <w:t>Team 40</w:t>
+      </w:r>
+      <w:r>
+        <w:t xml:space="preserve"> and include each member’s photo, name, assigned role and short blurb. The design should also consider responsiveness, accessibility and visual consistency. Once the UX design is complete, please hand it back to the BA for requirements validation before development begins.</w:t>
       </w:r>
     </w:p>
     <w:p>
@@ -348,24 +346,14 @@
             </w:r>
           </w:p>
           <w:p>
-            <w:pPr>
-              <w:rPr>
-                <w:rFonts w:hint="eastAsia"/>
-              </w:rPr>
-            </w:pPr>
             <w:proofErr w:type="spellStart"/>
             <w:r>
               <w:t>Faridullah</w:t>
             </w:r>
             <w:proofErr w:type="spellEnd"/>
             <w:r>
-              <w:t xml:space="preserve"> Jabbar </w:t>
-            </w:r>
-            <w:proofErr w:type="spellStart"/>
-            <w:r>
-              <w:t>Khil</w:t>
-            </w:r>
-            <w:proofErr w:type="spellEnd"/>
+              <w:t xml:space="preserve"> Jabbar Khil</w:t>
+            </w:r>
           </w:p>
         </w:tc>
         <w:tc>
@@ -619,24 +607,9 @@
             </w:r>
           </w:p>
           <w:p>
-            <w:pPr>
-              <w:rPr>
-                <w:rFonts w:hint="eastAsia"/>
-              </w:rPr>
-            </w:pPr>
-            <w:proofErr w:type="spellStart"/>
-            <w:r>
-              <w:t>Shakthijhaa</w:t>
-            </w:r>
-            <w:proofErr w:type="spellEnd"/>
-            <w:r>
-              <w:t xml:space="preserve"> </w:t>
-            </w:r>
-            <w:proofErr w:type="spellStart"/>
-            <w:r>
-              <w:t>Sivagnanam</w:t>
-            </w:r>
-            <w:proofErr w:type="spellEnd"/>
+            <w:r>
+              <w:t>Shakthijhaa Sivagnanam</w:t>
+            </w:r>
           </w:p>
         </w:tc>
         <w:tc>
@@ -842,19 +815,7 @@
           </w:p>
           <w:p>
             <w:r>
-              <w:t>Chan</w:t>
-            </w:r>
-            <w:r>
-              <w:t xml:space="preserve"> </w:t>
-            </w:r>
-            <w:r>
-              <w:t>Hoang</w:t>
-            </w:r>
-            <w:r>
-              <w:t xml:space="preserve"> </w:t>
-            </w:r>
-            <w:r>
-              <w:t>Truong</w:t>
+              <w:t>Chan Hoang Truong</w:t>
             </w:r>
           </w:p>
         </w:tc>
@@ -1144,19 +1105,7 @@
           </w:p>
           <w:p>
             <w:r>
-              <w:t>Chan</w:t>
-            </w:r>
-            <w:r>
-              <w:t xml:space="preserve"> </w:t>
-            </w:r>
-            <w:r>
-              <w:t>Hoang</w:t>
-            </w:r>
-            <w:r>
-              <w:t xml:space="preserve"> </w:t>
-            </w:r>
-            <w:r>
-              <w:t>Truong</w:t>
+              <w:t>Chan Hoang Truong</w:t>
             </w:r>
           </w:p>
         </w:tc>
@@ -1410,16 +1359,8 @@
               <w:rPr>
                 <w:color w:val="1E2761"/>
               </w:rPr>
-              <w:t xml:space="preserve">Alexander </w:t>
-            </w:r>
-            <w:proofErr w:type="spellStart"/>
-            <w:r>
-              <w:rPr>
-                <w:color w:val="1E2761"/>
-              </w:rPr>
-              <w:t>Gusman</w:t>
-            </w:r>
-            <w:proofErr w:type="spellEnd"/>
+              <w:t>Alexander Gusman</w:t>
+            </w:r>
           </w:p>
         </w:tc>
         <w:tc>
@@ -1633,16 +1574,8 @@
               <w:rPr>
                 <w:color w:val="1E2761"/>
               </w:rPr>
-              <w:t xml:space="preserve">Alexander </w:t>
-            </w:r>
-            <w:proofErr w:type="spellStart"/>
-            <w:r>
-              <w:rPr>
-                <w:color w:val="1E2761"/>
-              </w:rPr>
-              <w:t>Gusman</w:t>
-            </w:r>
-            <w:proofErr w:type="spellEnd"/>
+              <w:t>Alexander Gusman</w:t>
+            </w:r>
           </w:p>
         </w:tc>
         <w:tc>
@@ -2054,7 +1987,7 @@
 </file>
 
 <file path=word/endnotes.xml><?xml version="1.0" encoding="utf-8"?>
-<w:endnotes xmlns:wpc="http://schemas.microsoft.com/office/word/2010/wordprocessingCanvas" xmlns:cx="http://schemas.microsoft.com/office/drawing/2014/chartex" xmlns:cx1="http://schemas.microsoft.com/office/drawing/2015/9/8/chartex" xmlns:cx2="http://schemas.microsoft.com/office/drawing/2015/10/21/chartex" xmlns:cx3="http://schemas.microsoft.com/office/drawing/2016/5/9/chartex" xmlns:cx4="http://schemas.microsoft.com/office/drawing/2016/5/10/chartex" xmlns:cx5="http://schemas.microsoft.com/office/drawing/2016/5/11/chartex" xmlns:cx6="http://schemas.microsoft.com/office/drawing/2016/5/12/chartex" xmlns:cx7="http://schemas.microsoft.com/office/drawing/2016/5/13/chartex" xmlns:cx8="http://schemas.microsoft.com/office/drawing/2016/5/14/chartex" xmlns:mc="http://schemas.openxmlformats.org/markup-compatibility/2006" xmlns:aink="http://schemas.microsoft.com/office/drawing/2016/ink" xmlns:am3d="http://schemas.microsoft.com/office/drawing/2017/model3d" xmlns:o="urn:schemas-microsoft-com:office:office" xmlns:oel="http://schemas.microsoft.com/office/2019/extlst" xmlns:r="http://schemas.openxmlformats.org/officeDocument/2006/relationships" xmlns:m="http://schemas.openxmlformats.org/officeDocument/2006/math" xmlns:v="urn:schemas-microsoft-com:vml" xmlns:wp14="http://schemas.microsoft.com/office/word/2010/wordprocessingDrawing" xmlns:wp="http://schemas.openxmlformats.org/drawingml/2006/wordprocessingDrawing" xmlns:w10="urn:schemas-microsoft-com:office:word" xmlns:w="http://schemas.openxmlformats.org/wordprocessingml/2006/main" xmlns:w14="http://schemas.microsoft.com/office/word/2010/wordml" xmlns:w15="http://schemas.microsoft.com/office/word/2012/wordml" xmlns:w16cex="http://schemas.microsoft.com/office/word/2018/wordml/cex" xmlns:w16cid="http://schemas.microsoft.com/office/word/2016/wordml/cid" xmlns:w16="http://schemas.microsoft.com/office/word/2018/wordml" xmlns:w16du="http://schemas.microsoft.com/office/word/2023/wordml/word16du" xmlns:w16sdtdh="http://schemas.microsoft.com/office/word/2020/wordml/sdtdatahash" xmlns:w16se="http://schemas.microsoft.com/office/word/2015/wordml/symex" xmlns:wpg="http://schemas.microsoft.com/office/word/2010/wordprocessingGroup" xmlns:wpi="http://schemas.microsoft.com/office/word/2010/wordprocessingInk" xmlns:wne="http://schemas.microsoft.com/office/word/2006/wordml" xmlns:wps="http://schemas.microsoft.com/office/word/2010/wordprocessingShape" mc:Ignorable="w14 w15 w16se w16cid w16 w16cex w16sdtdh w16du wp14">
+<w:endnotes xmlns:wpc="http://schemas.microsoft.com/office/word/2010/wordprocessingCanvas" xmlns:cx="http://schemas.microsoft.com/office/drawing/2014/chartex" xmlns:cx1="http://schemas.microsoft.com/office/drawing/2015/9/8/chartex" xmlns:cx2="http://schemas.microsoft.com/office/drawing/2015/10/21/chartex" xmlns:cx3="http://schemas.microsoft.com/office/drawing/2016/5/9/chartex" xmlns:cx4="http://schemas.microsoft.com/office/drawing/2016/5/10/chartex" xmlns:cx5="http://schemas.microsoft.com/office/drawing/2016/5/11/chartex" xmlns:cx6="http://schemas.microsoft.com/office/drawing/2016/5/12/chartex" xmlns:cx7="http://schemas.microsoft.com/office/drawing/2016/5/13/chartex" xmlns:cx8="http://schemas.microsoft.com/office/drawing/2016/5/14/chartex" xmlns:mc="http://schemas.openxmlformats.org/markup-compatibility/2006" xmlns:m="http://schemas.openxmlformats.org/officeDocument/2006/math" xmlns:aink="http://schemas.microsoft.com/office/drawing/2016/ink" xmlns:am3d="http://schemas.microsoft.com/office/drawing/2017/model3d" xmlns:oel="http://schemas.microsoft.com/office/2019/extlst" xmlns:r="http://schemas.openxmlformats.org/officeDocument/2006/relationships" xmlns:wp14="http://schemas.microsoft.com/office/word/2010/wordprocessingDrawing" xmlns:wp="http://schemas.openxmlformats.org/drawingml/2006/wordprocessingDrawing" xmlns:wpg="http://schemas.microsoft.com/office/word/2010/wordprocessingGroup" xmlns:wpi="http://schemas.microsoft.com/office/word/2010/wordprocessingInk" xmlns:wps="http://schemas.microsoft.com/office/word/2010/wordprocessingShape" xmlns:o="urn:schemas-microsoft-com:office:office" xmlns:v="urn:schemas-microsoft-com:vml" xmlns:w10="urn:schemas-microsoft-com:office:word" xmlns:w="http://schemas.openxmlformats.org/wordprocessingml/2006/main" xmlns:w14="http://schemas.microsoft.com/office/word/2010/wordml" xmlns:w15="http://schemas.microsoft.com/office/word/2012/wordml" xmlns:w16cex="http://schemas.microsoft.com/office/word/2018/wordml/cex" xmlns:w16cid="http://schemas.microsoft.com/office/word/2016/wordml/cid" xmlns:w16="http://schemas.microsoft.com/office/word/2018/wordml" xmlns:w16sdtdh="http://schemas.microsoft.com/office/word/2020/wordml/sdtdatahash" xmlns:w16sdtfl="http://schemas.microsoft.com/office/word/2024/wordml/sdtformatlock" xmlns:w16se="http://schemas.microsoft.com/office/word/2015/wordml/symex" xmlns:w16du="http://schemas.microsoft.com/office/word/2023/wordml/word16du" xmlns:wne="http://schemas.microsoft.com/office/word/2006/wordml" mc:Ignorable="w14 w15 w16se w16cid w16 w16cex w16sdtdh w16sdtfl w16du wp14">
   <w:endnote w:type="separator" w:id="-1">
     <w:p>
       <w:r>
@@ -2073,7 +2006,7 @@
 </file>
 
 <file path=word/footnotes.xml><?xml version="1.0" encoding="utf-8"?>
-<w:footnotes xmlns:wpc="http://schemas.microsoft.com/office/word/2010/wordprocessingCanvas" xmlns:cx="http://schemas.microsoft.com/office/drawing/2014/chartex" xmlns:cx1="http://schemas.microsoft.com/office/drawing/2015/9/8/chartex" xmlns:cx2="http://schemas.microsoft.com/office/drawing/2015/10/21/chartex" xmlns:cx3="http://schemas.microsoft.com/office/drawing/2016/5/9/chartex" xmlns:cx4="http://schemas.microsoft.com/office/drawing/2016/5/10/chartex" xmlns:cx5="http://schemas.microsoft.com/office/drawing/2016/5/11/chartex" xmlns:cx6="http://schemas.microsoft.com/office/drawing/2016/5/12/chartex" xmlns:cx7="http://schemas.microsoft.com/office/drawing/2016/5/13/chartex" xmlns:cx8="http://schemas.microsoft.com/office/drawing/2016/5/14/chartex" xmlns:mc="http://schemas.openxmlformats.org/markup-compatibility/2006" xmlns:aink="http://schemas.microsoft.com/office/drawing/2016/ink" xmlns:am3d="http://schemas.microsoft.com/office/drawing/2017/model3d" xmlns:o="urn:schemas-microsoft-com:office:office" xmlns:oel="http://schemas.microsoft.com/office/2019/extlst" xmlns:r="http://schemas.openxmlformats.org/officeDocument/2006/relationships" xmlns:m="http://schemas.openxmlformats.org/officeDocument/2006/math" xmlns:v="urn:schemas-microsoft-com:vml" xmlns:wp14="http://schemas.microsoft.com/office/word/2010/wordprocessingDrawing" xmlns:wp="http://schemas.openxmlformats.org/drawingml/2006/wordprocessingDrawing" xmlns:w10="urn:schemas-microsoft-com:office:word" xmlns:w="http://schemas.openxmlformats.org/wordprocessingml/2006/main" xmlns:w14="http://schemas.microsoft.com/office/word/2010/wordml" xmlns:w15="http://schemas.microsoft.com/office/word/2012/wordml" xmlns:w16cex="http://schemas.microsoft.com/office/word/2018/wordml/cex" xmlns:w16cid="http://schemas.microsoft.com/office/word/2016/wordml/cid" xmlns:w16="http://schemas.microsoft.com/office/word/2018/wordml" xmlns:w16du="http://schemas.microsoft.com/office/word/2023/wordml/word16du" xmlns:w16sdtdh="http://schemas.microsoft.com/office/word/2020/wordml/sdtdatahash" xmlns:w16se="http://schemas.microsoft.com/office/word/2015/wordml/symex" xmlns:wpg="http://schemas.microsoft.com/office/word/2010/wordprocessingGroup" xmlns:wpi="http://schemas.microsoft.com/office/word/2010/wordprocessingInk" xmlns:wne="http://schemas.microsoft.com/office/word/2006/wordml" xmlns:wps="http://schemas.microsoft.com/office/word/2010/wordprocessingShape" mc:Ignorable="w14 w15 w16se w16cid w16 w16cex w16sdtdh w16du wp14">
+<w:footnotes xmlns:wpc="http://schemas.microsoft.com/office/word/2010/wordprocessingCanvas" xmlns:cx="http://schemas.microsoft.com/office/drawing/2014/chartex" xmlns:cx1="http://schemas.microsoft.com/office/drawing/2015/9/8/chartex" xmlns:cx2="http://schemas.microsoft.com/office/drawing/2015/10/21/chartex" xmlns:cx3="http://schemas.microsoft.com/office/drawing/2016/5/9/chartex" xmlns:cx4="http://schemas.microsoft.com/office/drawing/2016/5/10/chartex" xmlns:cx5="http://schemas.microsoft.com/office/drawing/2016/5/11/chartex" xmlns:cx6="http://schemas.microsoft.com/office/drawing/2016/5/12/chartex" xmlns:cx7="http://schemas.microsoft.com/office/drawing/2016/5/13/chartex" xmlns:cx8="http://schemas.microsoft.com/office/drawing/2016/5/14/chartex" xmlns:mc="http://schemas.openxmlformats.org/markup-compatibility/2006" xmlns:m="http://schemas.openxmlformats.org/officeDocument/2006/math" xmlns:aink="http://schemas.microsoft.com/office/drawing/2016/ink" xmlns:am3d="http://schemas.microsoft.com/office/drawing/2017/model3d" xmlns:oel="http://schemas.microsoft.com/office/2019/extlst" xmlns:r="http://schemas.openxmlformats.org/officeDocument/2006/relationships" xmlns:wp14="http://schemas.microsoft.com/office/word/2010/wordprocessingDrawing" xmlns:wp="http://schemas.openxmlformats.org/drawingml/2006/wordprocessingDrawing" xmlns:wpg="http://schemas.microsoft.com/office/word/2010/wordprocessingGroup" xmlns:wpi="http://schemas.microsoft.com/office/word/2010/wordprocessingInk" xmlns:wps="http://schemas.microsoft.com/office/word/2010/wordprocessingShape" xmlns:o="urn:schemas-microsoft-com:office:office" xmlns:v="urn:schemas-microsoft-com:vml" xmlns:w10="urn:schemas-microsoft-com:office:word" xmlns:w="http://schemas.openxmlformats.org/wordprocessingml/2006/main" xmlns:w14="http://schemas.microsoft.com/office/word/2010/wordml" xmlns:w15="http://schemas.microsoft.com/office/word/2012/wordml" xmlns:w16cex="http://schemas.microsoft.com/office/word/2018/wordml/cex" xmlns:w16cid="http://schemas.microsoft.com/office/word/2016/wordml/cid" xmlns:w16="http://schemas.microsoft.com/office/word/2018/wordml" xmlns:w16sdtdh="http://schemas.microsoft.com/office/word/2020/wordml/sdtdatahash" xmlns:w16sdtfl="http://schemas.microsoft.com/office/word/2024/wordml/sdtformatlock" xmlns:w16se="http://schemas.microsoft.com/office/word/2015/wordml/symex" xmlns:w16du="http://schemas.microsoft.com/office/word/2023/wordml/word16du" xmlns:wne="http://schemas.microsoft.com/office/word/2006/wordml" mc:Ignorable="w14 w15 w16se w16cid w16 w16cex w16sdtdh w16sdtfl w16du wp14">
   <w:footnote w:type="separator" w:id="-1">
     <w:p>
       <w:r>
@@ -2092,7 +2025,7 @@
 </file>
 
 <file path=word/header1.xml><?xml version="1.0" encoding="utf-8"?>
-<w:hdr xmlns:wpc="http://schemas.microsoft.com/office/word/2010/wordprocessingCanvas" xmlns:cx="http://schemas.microsoft.com/office/drawing/2014/chartex" xmlns:cx1="http://schemas.microsoft.com/office/drawing/2015/9/8/chartex" xmlns:cx2="http://schemas.microsoft.com/office/drawing/2015/10/21/chartex" xmlns:cx3="http://schemas.microsoft.com/office/drawing/2016/5/9/chartex" xmlns:cx4="http://schemas.microsoft.com/office/drawing/2016/5/10/chartex" xmlns:cx5="http://schemas.microsoft.com/office/drawing/2016/5/11/chartex" xmlns:cx6="http://schemas.microsoft.com/office/drawing/2016/5/12/chartex" xmlns:cx7="http://schemas.microsoft.com/office/drawing/2016/5/13/chartex" xmlns:cx8="http://schemas.microsoft.com/office/drawing/2016/5/14/chartex" xmlns:mc="http://schemas.openxmlformats.org/markup-compatibility/2006" xmlns:aink="http://schemas.microsoft.com/office/drawing/2016/ink" xmlns:am3d="http://schemas.microsoft.com/office/drawing/2017/model3d" xmlns:o="urn:schemas-microsoft-com:office:office" xmlns:oel="http://schemas.microsoft.com/office/2019/extlst" xmlns:r="http://schemas.openxmlformats.org/officeDocument/2006/relationships" xmlns:m="http://schemas.openxmlformats.org/officeDocument/2006/math" xmlns:v="urn:schemas-microsoft-com:vml" xmlns:wp14="http://schemas.microsoft.com/office/word/2010/wordprocessingDrawing" xmlns:wp="http://schemas.openxmlformats.org/drawingml/2006/wordprocessingDrawing" xmlns:w10="urn:schemas-microsoft-com:office:word" xmlns:w="http://schemas.openxmlformats.org/wordprocessingml/2006/main" xmlns:w14="http://schemas.microsoft.com/office/word/2010/wordml" xmlns:w15="http://schemas.microsoft.com/office/word/2012/wordml" xmlns:w16cex="http://schemas.microsoft.com/office/word/2018/wordml/cex" xmlns:w16cid="http://schemas.microsoft.com/office/word/2016/wordml/cid" xmlns:w16="http://schemas.microsoft.com/office/word/2018/wordml" xmlns:w16du="http://schemas.microsoft.com/office/word/2023/wordml/word16du" xmlns:w16sdtdh="http://schemas.microsoft.com/office/word/2020/wordml/sdtdatahash" xmlns:w16se="http://schemas.microsoft.com/office/word/2015/wordml/symex" xmlns:wpg="http://schemas.microsoft.com/office/word/2010/wordprocessingGroup" xmlns:wpi="http://schemas.microsoft.com/office/word/2010/wordprocessingInk" xmlns:wne="http://schemas.microsoft.com/office/word/2006/wordml" xmlns:wps="http://schemas.microsoft.com/office/word/2010/wordprocessingShape" mc:Ignorable="w14 w15 w16se w16cid w16 w16cex w16sdtdh w16du wp14">
+<w:hdr xmlns:wpc="http://schemas.microsoft.com/office/word/2010/wordprocessingCanvas" xmlns:cx="http://schemas.microsoft.com/office/drawing/2014/chartex" xmlns:cx1="http://schemas.microsoft.com/office/drawing/2015/9/8/chartex" xmlns:cx2="http://schemas.microsoft.com/office/drawing/2015/10/21/chartex" xmlns:cx3="http://schemas.microsoft.com/office/drawing/2016/5/9/chartex" xmlns:cx4="http://schemas.microsoft.com/office/drawing/2016/5/10/chartex" xmlns:cx5="http://schemas.microsoft.com/office/drawing/2016/5/11/chartex" xmlns:cx6="http://schemas.microsoft.com/office/drawing/2016/5/12/chartex" xmlns:cx7="http://schemas.microsoft.com/office/drawing/2016/5/13/chartex" xmlns:cx8="http://schemas.microsoft.com/office/drawing/2016/5/14/chartex" xmlns:mc="http://schemas.openxmlformats.org/markup-compatibility/2006" xmlns:m="http://schemas.openxmlformats.org/officeDocument/2006/math" xmlns:aink="http://schemas.microsoft.com/office/drawing/2016/ink" xmlns:am3d="http://schemas.microsoft.com/office/drawing/2017/model3d" xmlns:oel="http://schemas.microsoft.com/office/2019/extlst" xmlns:r="http://schemas.openxmlformats.org/officeDocument/2006/relationships" xmlns:wp14="http://schemas.microsoft.com/office/word/2010/wordprocessingDrawing" xmlns:wp="http://schemas.openxmlformats.org/drawingml/2006/wordprocessingDrawing" xmlns:wpg="http://schemas.microsoft.com/office/word/2010/wordprocessingGroup" xmlns:wpi="http://schemas.microsoft.com/office/word/2010/wordprocessingInk" xmlns:wps="http://schemas.microsoft.com/office/word/2010/wordprocessingShape" xmlns:o="urn:schemas-microsoft-com:office:office" xmlns:v="urn:schemas-microsoft-com:vml" xmlns:w10="urn:schemas-microsoft-com:office:word" xmlns:w="http://schemas.openxmlformats.org/wordprocessingml/2006/main" xmlns:w14="http://schemas.microsoft.com/office/word/2010/wordml" xmlns:w15="http://schemas.microsoft.com/office/word/2012/wordml" xmlns:w16cex="http://schemas.microsoft.com/office/word/2018/wordml/cex" xmlns:w16cid="http://schemas.microsoft.com/office/word/2016/wordml/cid" xmlns:w16="http://schemas.microsoft.com/office/word/2018/wordml" xmlns:w16sdtdh="http://schemas.microsoft.com/office/word/2020/wordml/sdtdatahash" xmlns:w16sdtfl="http://schemas.microsoft.com/office/word/2024/wordml/sdtformatlock" xmlns:w16se="http://schemas.microsoft.com/office/word/2015/wordml/symex" xmlns:w16du="http://schemas.microsoft.com/office/word/2023/wordml/word16du" xmlns:wne="http://schemas.microsoft.com/office/word/2006/wordml" mc:Ignorable="w14 w15 w16se w16cid w16 w16cex w16sdtdh w16sdtfl w16du wp14">
   <w:p>
     <w:pPr>
       <w:pStyle w:val="Header"/>
@@ -2156,7 +2089,7 @@
 </file>
 
 <file path=word/numbering.xml><?xml version="1.0" encoding="utf-8"?>
-<w:numbering xmlns:wpc="http://schemas.microsoft.com/office/word/2010/wordprocessingCanvas" xmlns:cx="http://schemas.microsoft.com/office/drawing/2014/chartex" xmlns:cx1="http://schemas.microsoft.com/office/drawing/2015/9/8/chartex" xmlns:cx2="http://schemas.microsoft.com/office/drawing/2015/10/21/chartex" xmlns:cx3="http://schemas.microsoft.com/office/drawing/2016/5/9/chartex" xmlns:cx4="http://schemas.microsoft.com/office/drawing/2016/5/10/chartex" xmlns:cx5="http://schemas.microsoft.com/office/drawing/2016/5/11/chartex" xmlns:cx6="http://schemas.microsoft.com/office/drawing/2016/5/12/chartex" xmlns:cx7="http://schemas.microsoft.com/office/drawing/2016/5/13/chartex" xmlns:cx8="http://schemas.microsoft.com/office/drawing/2016/5/14/chartex" xmlns:mc="http://schemas.openxmlformats.org/markup-compatibility/2006" xmlns:aink="http://schemas.microsoft.com/office/drawing/2016/ink" xmlns:am3d="http://schemas.microsoft.com/office/drawing/2017/model3d" xmlns:o="urn:schemas-microsoft-com:office:office" xmlns:oel="http://schemas.microsoft.com/office/2019/extlst" xmlns:r="http://schemas.openxmlformats.org/officeDocument/2006/relationships" xmlns:m="http://schemas.openxmlformats.org/officeDocument/2006/math" xmlns:v="urn:schemas-microsoft-com:vml" xmlns:wp14="http://schemas.microsoft.com/office/word/2010/wordprocessingDrawing" xmlns:wp="http://schemas.openxmlformats.org/drawingml/2006/wordprocessingDrawing" xmlns:w10="urn:schemas-microsoft-com:office:word" xmlns:w="http://schemas.openxmlformats.org/wordprocessingml/2006/main" xmlns:w14="http://schemas.microsoft.com/office/word/2010/wordml" xmlns:w15="http://schemas.microsoft.com/office/word/2012/wordml" xmlns:w16cex="http://schemas.microsoft.com/office/word/2018/wordml/cex" xmlns:w16cid="http://schemas.microsoft.com/office/word/2016/wordml/cid" xmlns:w16="http://schemas.microsoft.com/office/word/2018/wordml" xmlns:w16du="http://schemas.microsoft.com/office/word/2023/wordml/word16du" xmlns:w16sdtdh="http://schemas.microsoft.com/office/word/2020/wordml/sdtdatahash" xmlns:w16se="http://schemas.microsoft.com/office/word/2015/wordml/symex" xmlns:wpg="http://schemas.microsoft.com/office/word/2010/wordprocessingGroup" xmlns:wpi="http://schemas.microsoft.com/office/word/2010/wordprocessingInk" xmlns:wne="http://schemas.microsoft.com/office/word/2006/wordml" xmlns:wps="http://schemas.microsoft.com/office/word/2010/wordprocessingShape" mc:Ignorable="w14 w15 w16se w16cid w16 w16cex w16sdtdh w16du wp14">
+<w:numbering xmlns:wpc="http://schemas.microsoft.com/office/word/2010/wordprocessingCanvas" xmlns:cx="http://schemas.microsoft.com/office/drawing/2014/chartex" xmlns:cx1="http://schemas.microsoft.com/office/drawing/2015/9/8/chartex" xmlns:cx2="http://schemas.microsoft.com/office/drawing/2015/10/21/chartex" xmlns:cx3="http://schemas.microsoft.com/office/drawing/2016/5/9/chartex" xmlns:cx4="http://schemas.microsoft.com/office/drawing/2016/5/10/chartex" xmlns:cx5="http://schemas.microsoft.com/office/drawing/2016/5/11/chartex" xmlns:cx6="http://schemas.microsoft.com/office/drawing/2016/5/12/chartex" xmlns:cx7="http://schemas.microsoft.com/office/drawing/2016/5/13/chartex" xmlns:cx8="http://schemas.microsoft.com/office/drawing/2016/5/14/chartex" xmlns:mc="http://schemas.openxmlformats.org/markup-compatibility/2006" xmlns:m="http://schemas.openxmlformats.org/officeDocument/2006/math" xmlns:aink="http://schemas.microsoft.com/office/drawing/2016/ink" xmlns:am3d="http://schemas.microsoft.com/office/drawing/2017/model3d" xmlns:oel="http://schemas.microsoft.com/office/2019/extlst" xmlns:r="http://schemas.openxmlformats.org/officeDocument/2006/relationships" xmlns:wp14="http://schemas.microsoft.com/office/word/2010/wordprocessingDrawing" xmlns:wp="http://schemas.openxmlformats.org/drawingml/2006/wordprocessingDrawing" xmlns:wpg="http://schemas.microsoft.com/office/word/2010/wordprocessingGroup" xmlns:wpi="http://schemas.microsoft.com/office/word/2010/wordprocessingInk" xmlns:wps="http://schemas.microsoft.com/office/word/2010/wordprocessingShape" xmlns:o="urn:schemas-microsoft-com:office:office" xmlns:v="urn:schemas-microsoft-com:vml" xmlns:w10="urn:schemas-microsoft-com:office:word" xmlns:w="http://schemas.openxmlformats.org/wordprocessingml/2006/main" xmlns:w14="http://schemas.microsoft.com/office/word/2010/wordml" xmlns:w15="http://schemas.microsoft.com/office/word/2012/wordml" xmlns:w16cex="http://schemas.microsoft.com/office/word/2018/wordml/cex" xmlns:w16cid="http://schemas.microsoft.com/office/word/2016/wordml/cid" xmlns:w16="http://schemas.microsoft.com/office/word/2018/wordml" xmlns:w16sdtdh="http://schemas.microsoft.com/office/word/2020/wordml/sdtdatahash" xmlns:w16sdtfl="http://schemas.microsoft.com/office/word/2024/wordml/sdtformatlock" xmlns:w16se="http://schemas.microsoft.com/office/word/2015/wordml/symex" xmlns:w16du="http://schemas.microsoft.com/office/word/2023/wordml/word16du" xmlns:wne="http://schemas.microsoft.com/office/word/2006/wordml" mc:Ignorable="w14 w15 w16se w16cid w16 w16cex w16sdtdh w16sdtfl w16du wp14">
   <w:abstractNum w:abstractNumId="0" w15:restartNumberingAfterBreak="0">
     <w:nsid w:val="050B24B6"/>
     <w:multiLevelType w:val="hybridMultilevel"/>
@@ -2253,7 +2186,7 @@
 </file>
 
 <file path=word/styles.xml><?xml version="1.0" encoding="utf-8"?>
-<w:styles xmlns:mc="http://schemas.openxmlformats.org/markup-compatibility/2006" xmlns:r="http://schemas.openxmlformats.org/officeDocument/2006/relationships" xmlns:w="http://schemas.openxmlformats.org/wordprocessingml/2006/main" xmlns:w14="http://schemas.microsoft.com/office/word/2010/wordml" xmlns:w15="http://schemas.microsoft.com/office/word/2012/wordml" xmlns:w16cex="http://schemas.microsoft.com/office/word/2018/wordml/cex" xmlns:w16cid="http://schemas.microsoft.com/office/word/2016/wordml/cid" xmlns:w16="http://schemas.microsoft.com/office/word/2018/wordml" xmlns:w16du="http://schemas.microsoft.com/office/word/2023/wordml/word16du" xmlns:w16sdtdh="http://schemas.microsoft.com/office/word/2020/wordml/sdtdatahash" xmlns:w16se="http://schemas.microsoft.com/office/word/2015/wordml/symex" mc:Ignorable="w14 w15 w16se w16cid w16 w16cex w16sdtdh w16du">
+<w:styles xmlns:mc="http://schemas.openxmlformats.org/markup-compatibility/2006" xmlns:r="http://schemas.openxmlformats.org/officeDocument/2006/relationships" xmlns:w="http://schemas.openxmlformats.org/wordprocessingml/2006/main" xmlns:w14="http://schemas.microsoft.com/office/word/2010/wordml" xmlns:w15="http://schemas.microsoft.com/office/word/2012/wordml" xmlns:w16cex="http://schemas.microsoft.com/office/word/2018/wordml/cex" xmlns:w16cid="http://schemas.microsoft.com/office/word/2016/wordml/cid" xmlns:w16="http://schemas.microsoft.com/office/word/2018/wordml" xmlns:w16sdtdh="http://schemas.microsoft.com/office/word/2020/wordml/sdtdatahash" xmlns:w16sdtfl="http://schemas.microsoft.com/office/word/2024/wordml/sdtformatlock" xmlns:w16se="http://schemas.microsoft.com/office/word/2015/wordml/symex" xmlns:w16du="http://schemas.microsoft.com/office/word/2023/wordml/word16du" mc:Ignorable="w14 w15 w16se w16cid w16 w16cex w16sdtdh w16sdtfl w16du">
   <w:docDefaults>
     <w:rPrDefault>
       <w:rPr>
@@ -2941,6 +2874,30 @@
     <w:uiPriority w:val="99"/>
     <w:rsid w:val="00F95A76"/>
   </w:style>
+  <w:style w:type="character" w:styleId="HTMLCode">
+    <w:name w:val="HTML Code"/>
+    <w:basedOn w:val="DefaultParagraphFont"/>
+    <w:uiPriority w:val="99"/>
+    <w:semiHidden/>
+    <w:unhideWhenUsed/>
+    <w:rsid w:val="007A08BF"/>
+    <w:rPr>
+      <w:rFonts w:ascii="Courier New" w:eastAsia="Times New Roman" w:hAnsi="Courier New" w:cs="Courier New"/>
+      <w:sz w:val="20"/>
+      <w:szCs w:val="20"/>
+    </w:rPr>
+  </w:style>
+  <w:style w:type="character" w:styleId="Strong">
+    <w:name w:val="Strong"/>
+    <w:basedOn w:val="DefaultParagraphFont"/>
+    <w:uiPriority w:val="22"/>
+    <w:qFormat/>
+    <w:rsid w:val="007A08BF"/>
+    <w:rPr>
+      <w:b/>
+      <w:bCs/>
+    </w:rPr>
+  </w:style>
 </w:styles>
 </file>
 

</xml_diff>

<commit_message>
docs: update Team 40 master document
</commit_message>
<xml_diff>
--- a/docs/Master-Document-Team40.docx
+++ b/docs/Master-Document-Team40.docx
@@ -146,7 +146,13 @@
               <w:rPr>
                 <w:color w:val="1E2761"/>
               </w:rPr>
-              <w:t xml:space="preserve">Friday, </w:t>
+              <w:t>Mon</w:t>
+            </w:r>
+            <w:r>
+              <w:rPr>
+                <w:color w:val="1E2761"/>
+              </w:rPr>
+              <w:t xml:space="preserve">day, </w:t>
             </w:r>
             <w:r>
               <w:rPr>
@@ -189,7 +195,7 @@
         <w:t xml:space="preserve">Done: </w:t>
       </w:r>
       <w:r>
-        <w:t>Completed and documented the Business Analysis requirements for the Task 2 Mock Sprint feature, covering the styled Login Page, existing authentication behaviour, Login → Team Page redirect, Team Page content, non-functional requirements, acceptance criteria, scope, dependencies and UX handoff requirements.</w:t>
+        <w:t>Completed and documented the Business Analysis requirements for the Task 2 Mock Sprint feature, covering the styled Login Page, existing authentication behaviour, Login → Team Page redirect, Team Page content and field/display rules, key edge cases, non-functional requirements, acceptance criteria, scope, dependencies and UX handoff requirements.</w:t>
       </w:r>
     </w:p>
     <w:p>
@@ -228,7 +234,7 @@
         <w:t xml:space="preserve">Note for next role: </w:t>
       </w:r>
       <w:r>
-        <w:t xml:space="preserve">UX — please use the documented BA requirements to design the styled Login Page and Team Page. The existing email/password and Google sign-in functionality must be preserved, while successful authentication must ultimately direct users to </w:t>
+        <w:t xml:space="preserve">UX — please use the documented BA requirements to design the styled Login Page and Team Page. Existing email/password and Google sign-in functionality must be preserved, while successful authentication must direct users to </w:t>
       </w:r>
       <w:r>
         <w:rPr>
@@ -246,8 +252,79 @@
         <w:t>Team 40</w:t>
       </w:r>
       <w:r>
-        <w:t xml:space="preserve"> and include each member’s photo, name, assigned role and short blurb. The design should also consider responsiveness, accessibility and visual consistency. Once the UX design is complete, please hand it back to the BA for requirements validation before development begins.</w:t>
-      </w:r>
+        <w:t xml:space="preserve"> and include each member’s photo or placeholder avatar, name, assigned role and short blurb. Please also consider different blurb lengths, responsiveness, accessibility and visual consistency. Once the UX design is complete, hand it back to the BA for requirements validation before development begins.</w:t>
+      </w:r>
+    </w:p>
+    <w:p>
+      <w:pPr>
+        <w:pStyle w:val="NormalWeb"/>
+        <w:spacing w:before="0" w:beforeAutospacing="0" w:after="0" w:afterAutospacing="0"/>
+        <w:rPr>
+          <w:lang w:eastAsia="en-GB"/>
+        </w:rPr>
+      </w:pPr>
+      <w:r>
+        <w:rPr>
+          <w:b/>
+          <w:bCs/>
+        </w:rPr>
+        <w:t>Git URL:</w:t>
+      </w:r>
+      <w:r>
+        <w:t xml:space="preserve"> </w:t>
+      </w:r>
+      <w:hyperlink r:id="rId7" w:history="1">
+        <w:r>
+          <w:rPr>
+            <w:rStyle w:val="Hyperlink"/>
+            <w:rFonts w:ascii="Calibri" w:hAnsi="Calibri" w:cs="Calibri"/>
+            <w:sz w:val="25"/>
+            <w:szCs w:val="25"/>
+          </w:rPr>
+          <w:t>https://github.com/JianqiLu/garage-</w:t>
+        </w:r>
+        <w:r>
+          <w:rPr>
+            <w:rStyle w:val="Hyperlink"/>
+            <w:rFonts w:ascii="Calibri" w:hAnsi="Calibri" w:cs="Calibri"/>
+            <w:sz w:val="25"/>
+            <w:szCs w:val="25"/>
+          </w:rPr>
+          <w:t>b</w:t>
+        </w:r>
+        <w:r>
+          <w:rPr>
+            <w:rStyle w:val="Hyperlink"/>
+            <w:rFonts w:ascii="Calibri" w:hAnsi="Calibri" w:cs="Calibri"/>
+            <w:sz w:val="25"/>
+            <w:szCs w:val="25"/>
+          </w:rPr>
+          <w:t>o</w:t>
+        </w:r>
+        <w:r>
+          <w:rPr>
+            <w:rStyle w:val="Hyperlink"/>
+            <w:rFonts w:ascii="Calibri" w:hAnsi="Calibri" w:cs="Calibri"/>
+            <w:sz w:val="25"/>
+            <w:szCs w:val="25"/>
+          </w:rPr>
+          <w:t>i</w:t>
+        </w:r>
+        <w:r>
+          <w:rPr>
+            <w:rStyle w:val="Hyperlink"/>
+            <w:rFonts w:ascii="Calibri" w:hAnsi="Calibri" w:cs="Calibri"/>
+            <w:sz w:val="25"/>
+            <w:szCs w:val="25"/>
+          </w:rPr>
+          <w:t>lerplate-basic-s3935651/blob/main/docs/task2/BA-Requirements.md</w:t>
+        </w:r>
+      </w:hyperlink>
+    </w:p>
+    <w:p>
+      <w:pPr>
+        <w:spacing w:after="140"/>
+      </w:pPr>
     </w:p>
     <w:p>
       <w:pPr>
@@ -261,7 +338,15 @@
           <w:bCs/>
           <w:color w:val="FFFFFF"/>
         </w:rPr>
-        <w:t xml:space="preserve">Git URL:  </w:t>
+        <w:t>Git URL</w:t>
+      </w:r>
+      <w:r>
+        <w:rPr>
+          <w:b/>
+          <w:bCs/>
+          <w:color w:val="FFFFFF"/>
+        </w:rPr>
+        <w:t xml:space="preserve">: </w:t>
       </w:r>
     </w:p>
     <w:p>
@@ -474,7 +559,6 @@
         <w:rPr>
           <w:noProof/>
         </w:rPr>
-        <w:lastRenderedPageBreak/>
         <w:drawing>
           <wp:inline distT="0" distB="0" distL="0" distR="0" wp14:anchorId="684C28BF" wp14:editId="6A30DE2E">
             <wp:extent cx="3503930" cy="2589530"/>
@@ -493,7 +577,7 @@
                     </pic:cNvPicPr>
                   </pic:nvPicPr>
                   <pic:blipFill>
-                    <a:blip r:embed="rId7">
+                    <a:blip r:embed="rId8">
                       <a:extLst>
                         <a:ext uri="{28A0092B-C50C-407E-A947-70E740481C1C}">
                           <a14:useLocalDpi xmlns:a14="http://schemas.microsoft.com/office/drawing/2010/main" val="0"/>
@@ -940,6 +1024,7 @@
           <w:bCs/>
           <w:color w:val="FFFFFF"/>
         </w:rPr>
+        <w:lastRenderedPageBreak/>
         <w:t xml:space="preserve">Git URL (commit):  </w:t>
       </w:r>
     </w:p>
@@ -990,7 +1075,7 @@
                     </pic:cNvPicPr>
                   </pic:nvPicPr>
                   <pic:blipFill>
-                    <a:blip r:embed="rId8">
+                    <a:blip r:embed="rId9">
                       <a:extLst>
                         <a:ext uri="{28A0092B-C50C-407E-A947-70E740481C1C}">
                           <a14:useLocalDpi xmlns:a14="http://schemas.microsoft.com/office/drawing/2010/main" val="0"/>
@@ -1248,7 +1333,7 @@
                     </pic:cNvPicPr>
                   </pic:nvPicPr>
                   <pic:blipFill>
-                    <a:blip r:embed="rId9">
+                    <a:blip r:embed="rId10">
                       <a:extLst>
                         <a:ext uri="{28A0092B-C50C-407E-A947-70E740481C1C}">
                           <a14:useLocalDpi xmlns:a14="http://schemas.microsoft.com/office/drawing/2010/main" val="0"/>
@@ -1976,7 +2061,7 @@
       </w:pPr>
     </w:p>
     <w:sectPr>
-      <w:headerReference w:type="default" r:id="rId10"/>
+      <w:headerReference w:type="default" r:id="rId11"/>
       <w:pgSz w:w="12240" w:h="15840"/>
       <w:pgMar w:top="1440" w:right="1440" w:bottom="1440" w:left="1440" w:header="708" w:footer="708" w:gutter="0"/>
       <w:cols w:space="720"/>
@@ -2898,6 +2983,18 @@
       <w:bCs/>
     </w:rPr>
   </w:style>
+  <w:style w:type="character" w:styleId="FollowedHyperlink">
+    <w:name w:val="FollowedHyperlink"/>
+    <w:basedOn w:val="DefaultParagraphFont"/>
+    <w:uiPriority w:val="99"/>
+    <w:semiHidden/>
+    <w:unhideWhenUsed/>
+    <w:rsid w:val="0092385D"/>
+    <w:rPr>
+      <w:color w:val="96607D" w:themeColor="followedHyperlink"/>
+      <w:u w:val="single"/>
+    </w:rPr>
+  </w:style>
 </w:styles>
 </file>
 

</xml_diff>